<commit_message>
feat(landing): present portrait report and separate widescreen deck exports
</commit_message>
<xml_diff>
--- a/frontend/public/landing/samples/clean-energy-outlook.docx
+++ b/frontend/public/landing/samples/clean-energy-outlook.docx
@@ -28,7 +28,7 @@
         <w:keepNext/>
       </w:pPr>
       <w:r>
-        <w:t>Renewable deployment is shaped by policy and market conditions. The IEA’s Renewables 2025 examines electricity, transport and heat through 2030. [1] Storage gives variable wind and solar generation a way to serve demand at other times. The US Department of Energy describes both battery research and pumped storage hydropower. [2]</w:t>
+        <w:t>Renewable deployment is shaped by policy and market conditions. [1] Storage saves renewable electricity for later use. [2] This brief considers the transition, the role of storage and questions for leadership.</w:t>
       </w:r>
     </w:p>
     <w:p>
@@ -213,7 +213,7 @@
     </w:p>
     <w:p>
       <w:r>
-        <w:t xml:space="preserve">[1] International Energy Agency </w:t>
+        <w:t xml:space="preserve">[1] IEA </w:t>
       </w:r>
       <w:hyperlink r:id="rId9">
         <w:r>

</xml_diff>